<commit_message>
Add fixed Rs.500 initial consultation fee and receipt slip
- Agreement: add clause 2.1 for a fixed, non-refundable Rs.500 initial
  consultation/meetup fee charged to all clients (for time & consultancy,
  like doctors/lawyers); renumber old 2.1-2.4 to 2.2-2.5
- Reconcile no-fee-before-disbursement clauses (Section 9 and Section 16)
- Add new Ruralift_Consultation_Fee_Receipt.docx as a Rs.500 receipt slip
  explaining the fee is for time and consultancy only

Co-authored-by: shaanxbilhatiya-star <264103043+shaanxbilhatiya-star@users.noreply.github.com>
</commit_message>
<xml_diff>
--- a/Ruralift_Agreement_Updated.docx
+++ b/Ruralift_Agreement_Updated.docx
@@ -121,7 +121,7 @@
         <w:rPr>
           <w:b/>
         </w:rPr>
-        <w:t xml:space="preserve">(सफलता-आधारित शुल्क | भारतीय अनुबंध अधिनियम, 1872 के अंतर्गत)</w:t>
+        <w:t xml:space="preserve">(निश्चित प्रारंभिक परामर्श शुल्क एवं सफलता-आधारित शुल्क | भारतीय अनुबंध अधिनियम, 1872 के अंतर्गत)</w:t>
       </w:r>
       <w:r>
         <w:t xml:space="preserve"/>
@@ -632,17 +632,17 @@
           <w:b/>
           <w:sz w:val="28"/>
         </w:rPr>
-        <w:t xml:space="preserve">2. परामर्श शुल्क — सफलता-आधारित</w:t>
-      </w:r>
-    </w:p>
-    <w:p>
-      <w:r>
-        <w:t/>
-      </w:r>
-    </w:p>
-    <w:p>
-      <w:r>
-        <w:t xml:space="preserve">इस अनुबंध के अंतर्गत शुल्क संरचना पूर्णतः सफलता-आधारित है:</w:t>
+        <w:t xml:space="preserve">2. परामर्श शुल्क — प्रारंभिक परामर्श शुल्क एवं सफलता-आधारित शुल्क</w:t>
+      </w:r>
+    </w:p>
+    <w:p>
+      <w:r>
+        <w:t/>
+      </w:r>
+    </w:p>
+    <w:p>
+      <w:r>
+        <w:t xml:space="preserve">इस अनुबंध के अंतर्गत शुल्क संरचना दो भागों में है — (अ) एक निश्चित प्रारंभिक परामर्श/मुलाकात शुल्क जो सभी ग्राहकों पर समान रूप से लागू होता है, तथा (ब) ऋण के सफल वितरण पर देय सफलता-आधारित परामर्श शुल्क:</w:t>
       </w:r>
     </w:p>
     <w:p>
@@ -662,6 +662,20 @@
     </w:p>
     <w:p>
       <w:r>
+        <w:t xml:space="preserve">| प्रारंभिक परामर्श / प्रथम मुलाकात शुल्क (सभी ग्राहकों पर लागू) | </w:t>
+      </w:r>
+      <w:r>
+        <w:rPr>
+          <w:b/>
+        </w:rPr>
+        <w:t xml:space="preserve">रु. 500/- (रुपये पाँच सौ मात्र) — निश्चित, प्रथम मुलाकात/परामर्श के समय देय, अप्रतिदेय</w:t>
+      </w:r>
+      <w:r>
+        <w:t xml:space="preserve"> |</w:t>
+      </w:r>
+    </w:p>
+    <w:p>
+      <w:r>
         <w:t xml:space="preserve">| ऋणदाता द्वारा आवेदन अस्वीकृत (ग्राहक की चूक के बिना) | </w:t>
       </w:r>
       <w:r>
@@ -695,7 +709,16 @@
     </w:p>
     <w:p>
       <w:r>
-        <w:t xml:space="preserve">2.1 परामर्श शुल्क केवल ग्राहक के बैंक खाते में ऋण राशि के सफल वितरण के बाद ही देय होगा। किसी भी पूर्व चरण में किसी भी परिस्थिति में कोई शुल्क नहीं लिया जाएगा।</w:t>
+        <w:t xml:space="preserve">2.1 </w:t>
+      </w:r>
+      <w:r>
+        <w:rPr>
+          <w:b/>
+        </w:rPr>
+        <w:t xml:space="preserve">प्रारंभिक परामर्श / मुलाकात शुल्क (निश्चित):</w:t>
+      </w:r>
+      <w:r>
+        <w:t xml:space="preserve"> ग्राहक के साथ प्रथम मुलाकात/परामर्श बैठक के समय Ruralift एक निश्चित प्रारंभिक परामर्श शुल्क रु. 500/- (रुपये पाँच सौ मात्र) लेगा। यह शुल्क सभी ग्राहकों पर समान रूप से लागू होता है और पूर्णतः Ruralift द्वारा बैठक में दिए गए समय, विशेषज्ञ परामर्श, ऋण पात्रता आकलन एवं मार्गदर्शन के प्रतिफल (consideration) में है — ठीक उसी प्रकार जैसे चिकित्सक, अधिवक्ता एवं अन्य पेशेवर अपने परामर्श-समय हेतु निर्धारित शुल्क लेते हैं। यह शुल्क प्रथम मुलाकात के समय देय है और चूँकि यह केवल समय एवं परामर्श का मूल्य है, ऋण स्वीकृत हो अथवा न हो, यह अप्रतिदेय (non-refundable) रहेगा। यह प्रारंभिक परामर्श शुल्क धारा 2 में वर्णित सफलता-आधारित परामर्श शुल्क एवं किसी भी DSA/कमीशन से पूर्णतः पृथक एवं स्वतंत्र है।</w:t>
       </w:r>
     </w:p>
     <w:p>
@@ -711,6 +734,25 @@
         <w:rPr>
           <w:b/>
         </w:rPr>
+        <w:t xml:space="preserve">सफलता-आधारित परामर्श शुल्क:</w:t>
+      </w:r>
+      <w:r>
+        <w:t xml:space="preserve"> उपरोक्त निश्चित प्रारंभिक परामर्श शुल्क (धारा 2.1) के अतिरिक्त, सहमत सफलता-आधारित परामर्श शुल्क केवल ग्राहक के बैंक खाते में ऋण राशि के सफल वितरण के बाद ही देय होगा। धारा 2.1 के प्रारंभिक परामर्श शुल्क को छोड़कर, ऋण वितरण से पूर्व किसी भी चरण में कोई अन्य शुल्क या प्रसंस्करण शुल्क नहीं लिया जाएगा।</w:t>
+      </w:r>
+    </w:p>
+    <w:p>
+      <w:r>
+        <w:t/>
+      </w:r>
+    </w:p>
+    <w:p>
+      <w:r>
+        <w:t xml:space="preserve">2.3 </w:t>
+      </w:r>
+      <w:r>
+        <w:rPr>
+          <w:b/>
+        </w:rPr>
         <w:t xml:space="preserve">शुल्क का आधार:</w:t>
       </w:r>
       <w:r>
@@ -751,7 +793,7 @@
     </w:p>
     <w:p>
       <w:r>
-        <w:t xml:space="preserve">2.3 </w:t>
+        <w:t xml:space="preserve">2.4 </w:t>
       </w:r>
       <w:r>
         <w:rPr>
@@ -770,7 +812,7 @@
     </w:p>
     <w:p>
       <w:r>
-        <w:t xml:space="preserve">2.4 </w:t>
+        <w:t xml:space="preserve">2.5 </w:t>
       </w:r>
       <w:r>
         <w:rPr>
@@ -1636,7 +1678,7 @@
     </w:p>
     <w:p>
       <w:r>
-        <w:t xml:space="preserve">स. Ruralift किसी भी परिस्थिति में ऋण वितरण से पूर्व कोई शुल्क नहीं लेगा।</w:t>
+        <w:t xml:space="preserve">स. प्रारंभिक परामर्श/मुलाकात शुल्क (धारा 2.1 में वर्णित रु. 500/- निश्चित शुल्क) को छोड़कर, Ruralift किसी भी परिस्थिति में ऋण वितरण से पूर्व कोई अन्य शुल्क नहीं लेगा।</w:t>
       </w:r>
     </w:p>
     <w:p>
@@ -2461,7 +2503,7 @@
     </w:p>
     <w:p>
       <w:r>
-        <w:t xml:space="preserve">स. मैं सफलता-आधारित शुल्क संरचना को समझता/समझती हूँ और स्वीकार करता/करती हूँ कि अनुबंध की धारा 2 में दर्ज सहमत परामर्श शुल्क ऋण वितरण पर </w:t>
+        <w:t xml:space="preserve">स. मैं शुल्क संरचना को समझता/समझती हूँ और स्वीकार करता/करती हूँ कि धारा 2.1 में वर्णित रु. 500/- का प्रारंभिक परामर्श/मुलाकात शुल्क प्रथम मुलाकात के समय देय एवं अप्रतिदेय है, तथा धारा 2 में दर्ज सहमत सफलता-आधारित परामर्श शुल्क ऋण वितरण पर </w:t>
       </w:r>
       <w:r>
         <w:rPr>
@@ -2565,7 +2607,7 @@
         <w:t xml:space="preserve">कोई गारंटी नहीं</w:t>
       </w:r>
       <w:r>
-        <w:t xml:space="preserve"> दी गई है और मैं स्वीकार करता/करती हूँ कि शुल्क केवल सफल वितरण पर ही देय है।</w:t>
+        <w:t xml:space="preserve"> दी गई है और मैं स्वीकार करता/करती हूँ कि सफलता-आधारित परामर्श शुल्क केवल सफल वितरण पर ही देय है, जबकि धारा 2.1 का प्रारंभिक परामर्श शुल्क इससे पृथक एवं प्रथम मुलाकात पर देय है।</w:t>
       </w:r>
     </w:p>
     <w:p>

</xml_diff>